<commit_message>
docs(assignment-03): require Gemini 3.1 Pro Preview for temperature question
</commit_message>
<xml_diff>
--- a/assignments/03-assignment.docx
+++ b/assignments/03-assignment.docx
@@ -26,7 +26,7 @@
         <w:t xml:space="preserve">Emory University</w:t>
       </w:r>
     </w:p>
-    <w:bookmarkStart w:id="20" w:name="instructions"/>
+    <w:bookmarkStart w:id="21" w:name="instructions"/>
     <w:p>
       <w:pPr>
         <w:pStyle w:val="Heading2"/>
@@ -392,7 +392,7 @@
       </w:r>
     </w:p>
     <w:bookmarkEnd w:id="9"/>
-    <w:bookmarkStart w:id="11" w:name="question-2-temperature-experiment"/>
+    <w:bookmarkStart w:id="12" w:name="question-2-temperature-experiment"/>
     <w:p>
       <w:pPr>
         <w:pStyle w:val="Heading3"/>
@@ -451,7 +451,37 @@
         <w:t xml:space="preserve"> </w:t>
       </w:r>
       <w:r>
-        <w:t xml:space="preserve">and sign in. In the settings panel, turn</w:t>
+        <w:t xml:space="preserve">and sign in. Use</w:t>
+      </w:r>
+      <w:r>
+        <w:t xml:space="preserve"> </w:t>
+      </w:r>
+      <w:r>
+        <w:rPr>
+          <w:b/>
+          <w:bCs/>
+        </w:rPr>
+        <w:t xml:space="preserve">Gemini 3.1 Pro Preview</w:t>
+      </w:r>
+      <w:r>
+        <w:t xml:space="preserve"> </w:t>
+      </w:r>
+      <w:r>
+        <w:t xml:space="preserve">for every step of this question, because it is the only model that shows the temperature setting. This link opens it directly:</w:t>
+      </w:r>
+      <w:r>
+        <w:t xml:space="preserve"> </w:t>
+      </w:r>
+      <w:hyperlink r:id="rId11">
+        <w:r>
+          <w:rPr>
+            <w:rStyle w:val="Hyperlink"/>
+          </w:rPr>
+          <w:t xml:space="preserve">https://aistudio.google.com/prompts/new_chat?model=gemini-3.1-pro-preview</w:t>
+        </w:r>
+      </w:hyperlink>
+      <w:r>
+        <w:t xml:space="preserve">. In the settings panel, turn</w:t>
       </w:r>
       <w:r>
         <w:t xml:space="preserve"> </w:t>
@@ -675,8 +705,8 @@
         </w:pict>
       </w:r>
     </w:p>
-    <w:bookmarkEnd w:id="11"/>
-    <w:bookmarkStart w:id="13" w:name="question-3-seeing-like-a-tokeniser"/>
+    <w:bookmarkEnd w:id="12"/>
+    <w:bookmarkStart w:id="14" w:name="question-3-seeing-like-a-tokeniser"/>
     <w:p>
       <w:pPr>
         <w:pStyle w:val="Heading3"/>
@@ -719,7 +749,7 @@
       <w:r>
         <w:t xml:space="preserve"> </w:t>
       </w:r>
-      <w:hyperlink r:id="rId12">
+      <w:hyperlink r:id="rId13">
         <w:r>
           <w:rPr>
             <w:rStyle w:val="Hyperlink"/>
@@ -976,8 +1006,8 @@
         </w:pict>
       </w:r>
     </w:p>
-    <w:bookmarkEnd w:id="13"/>
-    <w:bookmarkStart w:id="16" w:name="question-4-same-sound-different-word"/>
+    <w:bookmarkEnd w:id="14"/>
+    <w:bookmarkStart w:id="17" w:name="question-4-same-sound-different-word"/>
     <w:p>
       <w:pPr>
         <w:pStyle w:val="Heading3"/>
@@ -1008,7 +1038,7 @@
       <w:r>
         <w:t xml:space="preserve"> </w:t>
       </w:r>
-      <w:hyperlink r:id="rId14">
+      <w:hyperlink r:id="rId15">
         <w:r>
           <w:rPr>
             <w:rStyle w:val="Hyperlink"/>
@@ -1022,7 +1052,7 @@
       <w:r>
         <w:t xml:space="preserve"> </w:t>
       </w:r>
-      <w:hyperlink r:id="rId15">
+      <w:hyperlink r:id="rId16">
         <w:r>
           <w:rPr>
             <w:rStyle w:val="Hyperlink"/>
@@ -1202,8 +1232,8 @@
         </w:pict>
       </w:r>
     </w:p>
-    <w:bookmarkEnd w:id="16"/>
-    <w:bookmarkStart w:id="18" w:name="question-5-train-your-own-classifier"/>
+    <w:bookmarkEnd w:id="17"/>
+    <w:bookmarkStart w:id="19" w:name="question-5-train-your-own-classifier"/>
     <w:p>
       <w:pPr>
         <w:pStyle w:val="Heading3"/>
@@ -1226,7 +1256,7 @@
       <w:r>
         <w:t xml:space="preserve"> </w:t>
       </w:r>
-      <w:hyperlink r:id="rId17">
+      <w:hyperlink r:id="rId18">
         <w:r>
           <w:rPr>
             <w:rStyle w:val="Hyperlink"/>
@@ -1462,8 +1492,8 @@
         </w:pict>
       </w:r>
     </w:p>
-    <w:bookmarkEnd w:id="18"/>
-    <w:bookmarkStart w:id="19" w:name="bonus-question-where-do-we-draw-the-line"/>
+    <w:bookmarkEnd w:id="19"/>
+    <w:bookmarkStart w:id="20" w:name="bonus-question-where-do-we-draw-the-line"/>
     <w:p>
       <w:pPr>
         <w:pStyle w:val="Heading3"/>
@@ -1623,8 +1653,8 @@
         <w:br/>
       </w:r>
     </w:p>
-    <w:bookmarkEnd w:id="19"/>
     <w:bookmarkEnd w:id="20"/>
+    <w:bookmarkEnd w:id="21"/>
     <w:sectPr>
       <w:footnotePr>
         <w:numRestart w:val="eachSect"/>

</xml_diff>